<commit_message>
Fix localized timezone bug causing trading days to shift into weekends
</commit_message>
<xml_diff>
--- a/1/DRM_Project_Report.docx
+++ b/1/DRM_Project_Report.docx
@@ -186,7 +186,7 @@
           </w:tcPr>
           <w:p>
             <w:r>
-              <w:t>-0.0003</w:t>
+              <w:t>-0.0002</w:t>
             </w:r>
           </w:p>
         </w:tc>
@@ -196,7 +196,7 @@
           </w:tcPr>
           <w:p>
             <w:r>
-              <w:t>-0.0765</w:t>
+              <w:t>-0.0419</w:t>
             </w:r>
           </w:p>
         </w:tc>
@@ -206,7 +206,7 @@
           </w:tcPr>
           <w:p>
             <w:r>
-              <w:t>0.0159</w:t>
+              <w:t>0.0160</w:t>
             </w:r>
           </w:p>
         </w:tc>
@@ -216,7 +216,7 @@
           </w:tcPr>
           <w:p>
             <w:r>
-              <w:t>0.2526</w:t>
+              <w:t>0.2544</w:t>
             </w:r>
           </w:p>
         </w:tc>
@@ -226,7 +226,7 @@
           </w:tcPr>
           <w:p>
             <w:r>
-              <w:t>-0.1537</w:t>
+              <w:t>-0.1373</w:t>
             </w:r>
           </w:p>
         </w:tc>
@@ -236,7 +236,7 @@
           </w:tcPr>
           <w:p>
             <w:r>
-              <w:t>2.3907</w:t>
+              <w:t>2.3040</w:t>
             </w:r>
           </w:p>
         </w:tc>
@@ -246,7 +246,7 @@
           </w:tcPr>
           <w:p>
             <w:r>
-              <w:t>-0.5166</w:t>
+              <w:t>-0.3768</w:t>
             </w:r>
           </w:p>
         </w:tc>
@@ -284,7 +284,7 @@
           </w:tcPr>
           <w:p>
             <w:r>
-              <w:t>0.0008</w:t>
+              <w:t>0.0009</w:t>
             </w:r>
           </w:p>
         </w:tc>
@@ -294,7 +294,7 @@
           </w:tcPr>
           <w:p>
             <w:r>
-              <w:t>0.2035</w:t>
+              <w:t>0.2319</w:t>
             </w:r>
           </w:p>
         </w:tc>
@@ -314,7 +314,7 @@
           </w:tcPr>
           <w:p>
             <w:r>
-              <w:t>0.3967</w:t>
+              <w:t>0.3969</w:t>
             </w:r>
           </w:p>
         </w:tc>
@@ -324,7 +324,7 @@
           </w:tcPr>
           <w:p>
             <w:r>
-              <w:t>1.4208</w:t>
+              <w:t>1.4051</w:t>
             </w:r>
           </w:p>
         </w:tc>
@@ -334,7 +334,7 @@
           </w:tcPr>
           <w:p>
             <w:r>
-              <w:t>5.4193</w:t>
+              <w:t>5.3503</w:t>
             </w:r>
           </w:p>
         </w:tc>
@@ -344,7 +344,7 @@
           </w:tcPr>
           <w:p>
             <w:r>
-              <w:t>0.3768</w:t>
+              <w:t>0.4481</w:t>
             </w:r>
           </w:p>
         </w:tc>
@@ -353,7 +353,7 @@
     <w:p>
       <w:r>
         <w:br/>
-        <w:t>Correlation between TECHM and RAIN: 0.1360</w:t>
+        <w:t>Correlation between TECHM and RAIN: 0.1439</w:t>
       </w:r>
     </w:p>
     <w:p>
@@ -400,23 +400,23 @@
     <w:p>
       <w:r>
         <w:br/>
-        <w:t>February Futures Contract Final PnL: 11659751.97 INR</w:t>
+        <w:t>February Futures Contract Final PnL: 12542309.43 INR</w:t>
       </w:r>
     </w:p>
     <w:p>
       <w:r>
-        <w:t>Equivalent Forward PnL (Feb): 11659751.97 INR</w:t>
+        <w:t>Equivalent Forward PnL (Feb): 12542309.43 INR</w:t>
       </w:r>
     </w:p>
     <w:p>
       <w:r>
         <w:br/>
-        <w:t>March Futures Contract Final PnL: 10660296.80 INR</w:t>
+        <w:t>March Futures Contract Final PnL: 11282949.66 INR</w:t>
       </w:r>
     </w:p>
     <w:p>
       <w:r>
-        <w:t>Equivalent Forward PnL (Mar): 10660296.80 INR</w:t>
+        <w:t>Equivalent Forward PnL (Mar): 11282949.66 INR</w:t>
       </w:r>
     </w:p>
     <w:p>

</xml_diff>